<commit_message>
Deploying to gh-pages from @ Morrison-Lab/wai@bcd8319a8139180033ab7e5ff3e60138ff78d844 🚀
</commit_message>
<xml_diff>
--- a/chapters/ai-use-policies.docx
+++ b/chapters/ai-use-policies.docx
@@ -15,7 +15,7 @@
         <w:pStyle w:val="Date"/>
       </w:pPr>
       <w:r>
-        <w:t xml:space="preserve">Last modified: 2026-09-01 15:56:38 (PDT)</w:t>
+        <w:t xml:space="preserve">Last modified: 2026-09-01 16:49:22 (PDT)</w:t>
       </w:r>
     </w:p>
     <w:p>
@@ -189,7 +189,7 @@
         </w:tc>
       </w:tr>
     </w:tbl>
-    <w:bookmarkStart w:id="15" w:name="responsibility-for-validation"/>
+    <w:bookmarkStart w:id="20" w:name="responsibility-for-validation"/>
     <w:p>
       <w:pPr>
         <w:pStyle w:val="Heading1"/>
@@ -428,8 +428,303 @@
         </w:tc>
       </w:tr>
     </w:tbl>
-    <w:bookmarkEnd w:id="15"/>
-    <w:bookmarkStart w:id="16" w:name="sec-ai-disclosure"/>
+    <w:p>
+      <w:pPr>
+        <w:pStyle w:val="BodyText"/>
+      </w:pPr>
+      <w:r>
+        <w:t xml:space="preserve"> </w:t>
+      </w:r>
+    </w:p>
+    <w:tbl>
+      <w:tblPr>
+        <w:tblStyle w:val="Table"/>
+        <w:tblLook w:firstRow="0" w:lastRow="0" w:firstColumn="0" w:lastColumn="0" w:noHBand="0" w:noVBand="0" w:val="0000"/>
+        <w:tblBorders>
+          <w:top w:val="single" w:sz="4" w:space="0" w:color="FC5300"/>
+          <w:left w:val="single" w:sz="24" w:space="0" w:color="FC5300"/>
+          <w:bottom w:val="single" w:sz="4" w:space="0" w:color="FC5300"/>
+          <w:right w:val="single" w:sz="4" w:space="0" w:color="FC5300"/>
+        </w:tblBorders>
+        <w:tblCellMar>
+          <w:left w:w="144" w:type="dxa"/>
+          <w:right w:w="144" w:type="dxa"/>
+        </w:tblCellMar>
+        <w:tblLook w:firstRow="0" w:lastRow="0" w:firstColumn="0" w:lastColumn="0" w:noHBand="0" w:noVBand="0" w:val="0000"/>
+      </w:tblPr>
+      <w:tr>
+        <w:trPr>
+          <w:cantSplit/>
+        </w:trPr>
+        <w:tc>
+          <w:tcPr>
+            <w:shd w:color="auto" w:fill="ffe5d0" w:val="clear"/>
+            <w:tcMar>
+              <w:top w:w="92" w:type="dxa"/>
+              <w:bottom w:w="92" w:type="dxa"/>
+            </w:tcMar>
+          </w:tcPr>
+          <w:p>
+            <w:pPr>
+              <w:pStyle w:val="BodyText"/>
+            </w:pPr>
+            <w:pPr>
+              <w:spacing w:before="0" w:after="0"/>
+              <w:textAlignment w:val="center"/>
+            </w:pPr>
+            <w:r>
+              <w:drawing>
+                <wp:inline>
+                  <wp:extent cx="152400" cy="152400"/>
+                  <wp:effectExtent b="0" l="0" r="0" t="0"/>
+                  <wp:docPr descr="" title="" id="16" name="Picture"/>
+                  <a:graphic>
+                    <a:graphicData uri="http://schemas.openxmlformats.org/drawingml/2006/picture">
+                      <pic:pic>
+                        <pic:nvPicPr>
+                          <pic:cNvPr descr="/opt/quarto/share/formats/docx/caution.png" id="17" name="Picture"/>
+                          <pic:cNvPicPr>
+                            <a:picLocks noChangeArrowheads="1" noChangeAspect="1"/>
+                          </pic:cNvPicPr>
+                        </pic:nvPicPr>
+                        <pic:blipFill>
+                          <a:blip r:embed="rId15"/>
+                          <a:stretch>
+                            <a:fillRect/>
+                          </a:stretch>
+                        </pic:blipFill>
+                        <pic:spPr bwMode="auto">
+                          <a:xfrm>
+                            <a:off x="0" y="0"/>
+                            <a:ext cx="152400" cy="152400"/>
+                          </a:xfrm>
+                          <a:prstGeom prst="rect">
+                            <a:avLst/>
+                          </a:prstGeom>
+                          <a:noFill/>
+                          <a:ln w="9525">
+                            <a:noFill/>
+                            <a:headEnd/>
+                            <a:tailEnd/>
+                          </a:ln>
+                        </pic:spPr>
+                      </pic:pic>
+                    </a:graphicData>
+                  </a:graphic>
+                </wp:inline>
+              </w:drawing>
+            </w:r>
+            <w:r>
+              <w:t xml:space="preserve"> </w:t>
+            </w:r>
+            <w:r>
+              <w:t xml:space="preserve"> </w:t>
+            </w:r>
+            <w:r>
+              <w:t xml:space="preserve">A worked example: the defects the builder cannot see</w:t>
+            </w:r>
+          </w:p>
+        </w:tc>
+      </w:tr>
+      <w:tr>
+        <w:trPr>
+          <w:cantSplit/>
+        </w:trPr>
+        <w:tc>
+          <w:tcPr>
+            <w:tcMar>
+              <w:top w:w="108" w:type="dxa"/>
+              <w:bottom w:w="108" w:type="dxa"/>
+            </w:tcMar>
+          </w:tcPr>
+          <w:p>
+            <w:pPr>
+              <w:pStyle w:val="BodyText"/>
+            </w:pPr>
+            <w:pPr>
+              <w:spacing w:before="16"/>
+            </w:pPr>
+            <w:r>
+              <w:t xml:space="preserve">A public field report from a non-programmer</w:t>
+            </w:r>
+            <w:r>
+              <w:t xml:space="preserve"> </w:t>
+            </w:r>
+            <w:r>
+              <w:t xml:space="preserve">(</w:t>
+            </w:r>
+            <w:hyperlink r:id="rId18">
+              <w:r>
+                <w:rPr>
+                  <w:rStyle w:val="Hyperlink"/>
+                </w:rPr>
+                <w:t xml:space="preserve">“Vibe coded this game in four months”</w:t>
+              </w:r>
+            </w:hyperlink>
+            <w:r>
+              <w:t xml:space="preserve">,</w:t>
+            </w:r>
+            <w:r>
+              <w:t xml:space="preserve"> </w:t>
+            </w:r>
+            <w:r>
+              <w:t xml:space="preserve">r/ClaudeCode, 2026-08-22;</w:t>
+            </w:r>
+            <w:r>
+              <w:t xml:space="preserve"> </w:t>
+            </w:r>
+            <w:r>
+              <w:t xml:space="preserve">summarized in</w:t>
+            </w:r>
+            <w:r>
+              <w:t xml:space="preserve"> </w:t>
+            </w:r>
+            <w:hyperlink r:id="rId19">
+              <w:r>
+                <w:rPr>
+                  <w:rStyle w:val="Hyperlink"/>
+                </w:rPr>
+                <w:t xml:space="preserve">issue #98</w:t>
+              </w:r>
+            </w:hyperlink>
+            <w:r>
+              <w:t xml:space="preserve">)</w:t>
+            </w:r>
+            <w:r>
+              <w:t xml:space="preserve"> </w:t>
+            </w:r>
+            <w:r>
+              <w:t xml:space="preserve">describes four months of building a browser racing game with coding agents,</w:t>
+            </w:r>
+            <w:r>
+              <w:t xml:space="preserve"> </w:t>
+            </w:r>
+            <w:r>
+              <w:t xml:space="preserve">and reports that most things worked on the first try.</w:t>
+            </w:r>
+            <w:r>
+              <w:t xml:space="preserve"> </w:t>
+            </w:r>
+            <w:r>
+              <w:t xml:space="preserve">The comment thread under it says otherwise.</w:t>
+            </w:r>
+            <w:r>
+              <w:t xml:space="preserve"> </w:t>
+            </w:r>
+            <w:r>
+              <w:t xml:space="preserve">Players reported:</w:t>
+            </w:r>
+          </w:p>
+          <w:p>
+            <w:pPr>
+              <w:pStyle w:val="Compact"/>
+              <w:numPr>
+                <w:ilvl w:val="0"/>
+                <w:numId w:val="1006"/>
+              </w:numPr>
+            </w:pPr>
+            <w:r>
+              <w:t xml:space="preserve">a minimap announcing a turn in the wrong direction</w:t>
+            </w:r>
+          </w:p>
+          <w:p>
+            <w:pPr>
+              <w:pStyle w:val="Compact"/>
+              <w:numPr>
+                <w:ilvl w:val="0"/>
+                <w:numId w:val="1006"/>
+              </w:numPr>
+            </w:pPr>
+            <w:r>
+              <w:t xml:space="preserve">speed boosts invisible from any distance</w:t>
+            </w:r>
+          </w:p>
+          <w:p>
+            <w:pPr>
+              <w:pStyle w:val="Compact"/>
+              <w:numPr>
+                <w:ilvl w:val="0"/>
+                <w:numId w:val="1006"/>
+              </w:numPr>
+            </w:pPr>
+            <w:r>
+              <w:t xml:space="preserve">an orbit track with no visible route</w:t>
+            </w:r>
+          </w:p>
+          <w:p>
+            <w:pPr>
+              <w:pStyle w:val="Compact"/>
+              <w:numPr>
+                <w:ilvl w:val="0"/>
+                <w:numId w:val="1006"/>
+              </w:numPr>
+            </w:pPr>
+            <w:r>
+              <w:t xml:space="preserve">an accelerator with no consequences</w:t>
+            </w:r>
+          </w:p>
+          <w:p>
+            <w:pPr>
+              <w:pStyle w:val="FirstParagraph"/>
+            </w:pPr>
+            <w:pPr>
+              <w:spacing w:after="16"/>
+            </w:pPr>
+            <w:r>
+              <w:t xml:space="preserve">Every one of those defects looks correct to the person who built it,</w:t>
+            </w:r>
+            <w:r>
+              <w:t xml:space="preserve"> </w:t>
+            </w:r>
+            <w:r>
+              <w:t xml:space="preserve">because the builder reads the underlying state in their own head</w:t>
+            </w:r>
+            <w:r>
+              <w:t xml:space="preserve"> </w:t>
+            </w:r>
+            <w:r>
+              <w:t xml:space="preserve">and sees the display agree with it.</w:t>
+            </w:r>
+            <w:r>
+              <w:t xml:space="preserve"> </w:t>
+            </w:r>
+            <w:r>
+              <w:t xml:space="preserve">They surface only on contact with someone who has nothing but the display.</w:t>
+            </w:r>
+            <w:r>
+              <w:t xml:space="preserve"> </w:t>
+            </w:r>
+            <w:r>
+              <w:t xml:space="preserve">Neither the report nor its thread mentions any automated verification.</w:t>
+            </w:r>
+            <w:r>
+              <w:t xml:space="preserve"> </w:t>
+            </w:r>
+            <w:r>
+              <w:t xml:space="preserve">That is the answer to</w:t>
+            </w:r>
+            <w:r>
+              <w:t xml:space="preserve"> </w:t>
+            </w:r>
+            <w:r>
+              <w:t xml:space="preserve">“why bother instrumenting checks when the thing looks fine”</w:t>
+            </w:r>
+            <w:r>
+              <w:t xml:space="preserve">:</w:t>
+            </w:r>
+            <w:r>
+              <w:t xml:space="preserve"> </w:t>
+            </w:r>
+            <w:r>
+              <w:t xml:space="preserve">the thing looks fine to you precisely because you know what it is supposed to do.</w:t>
+            </w:r>
+          </w:p>
+          <w:p/>
+        </w:tc>
+      </w:tr>
+    </w:tbl>
+    <w:bookmarkEnd w:id="20"/>
+    <w:bookmarkStart w:id="21" w:name="sec-ai-disclosure"/>
     <w:p>
       <w:pPr>
         <w:pStyle w:val="Heading1"/>
@@ -467,7 +762,7 @@
         <w:pStyle w:val="Compact"/>
         <w:numPr>
           <w:ilvl w:val="0"/>
-          <w:numId w:val="1006"/>
+          <w:numId w:val="1007"/>
         </w:numPr>
       </w:pPr>
       <w:r>
@@ -479,7 +774,7 @@
         <w:pStyle w:val="Compact"/>
         <w:numPr>
           <w:ilvl w:val="0"/>
-          <w:numId w:val="1006"/>
+          <w:numId w:val="1007"/>
         </w:numPr>
       </w:pPr>
       <w:r>
@@ -491,7 +786,7 @@
         <w:pStyle w:val="Compact"/>
         <w:numPr>
           <w:ilvl w:val="0"/>
-          <w:numId w:val="1006"/>
+          <w:numId w:val="1007"/>
         </w:numPr>
       </w:pPr>
       <w:r>
@@ -503,7 +798,7 @@
         <w:pStyle w:val="Compact"/>
         <w:numPr>
           <w:ilvl w:val="0"/>
-          <w:numId w:val="1006"/>
+          <w:numId w:val="1007"/>
         </w:numPr>
       </w:pPr>
       <w:r>
@@ -538,8 +833,8 @@
         <w:t xml:space="preserve"># and has been reviewed and tested to ensure correctness</w:t>
       </w:r>
     </w:p>
-    <w:bookmarkEnd w:id="16"/>
-    <w:bookmarkStart w:id="17" w:name="attribution-of-sources"/>
+    <w:bookmarkEnd w:id="21"/>
+    <w:bookmarkStart w:id="22" w:name="attribution-of-sources"/>
     <w:p>
       <w:pPr>
         <w:pStyle w:val="Heading1"/>
@@ -603,7 +898,7 @@
         <w:pStyle w:val="Compact"/>
         <w:numPr>
           <w:ilvl w:val="0"/>
-          <w:numId w:val="1007"/>
+          <w:numId w:val="1008"/>
         </w:numPr>
       </w:pPr>
       <w:r>
@@ -615,7 +910,7 @@
         <w:pStyle w:val="Compact"/>
         <w:numPr>
           <w:ilvl w:val="0"/>
-          <w:numId w:val="1007"/>
+          <w:numId w:val="1008"/>
         </w:numPr>
       </w:pPr>
       <w:r>
@@ -627,7 +922,7 @@
         <w:pStyle w:val="Compact"/>
         <w:numPr>
           <w:ilvl w:val="0"/>
-          <w:numId w:val="1007"/>
+          <w:numId w:val="1008"/>
         </w:numPr>
       </w:pPr>
       <w:r>
@@ -639,7 +934,7 @@
         <w:pStyle w:val="Compact"/>
         <w:numPr>
           <w:ilvl w:val="0"/>
-          <w:numId w:val="1007"/>
+          <w:numId w:val="1008"/>
         </w:numPr>
       </w:pPr>
       <w:r>
@@ -684,8 +979,8 @@
         <w:t xml:space="preserve">rather than simply asking it to summarize information on a topic.</w:t>
       </w:r>
     </w:p>
-    <w:bookmarkEnd w:id="17"/>
-    <w:bookmarkStart w:id="23" w:name="sec-ai-journal-articles"/>
+    <w:bookmarkEnd w:id="22"/>
+    <w:bookmarkStart w:id="28" w:name="sec-ai-journal-articles"/>
     <w:p>
       <w:pPr>
         <w:pStyle w:val="Heading1"/>
@@ -726,7 +1021,7 @@
         <w:t xml:space="preserve">The following practices help achieve these goals.</w:t>
       </w:r>
     </w:p>
-    <w:bookmarkStart w:id="18" w:name="establish-a-clear-track-record"/>
+    <w:bookmarkStart w:id="23" w:name="establish-a-clear-track-record"/>
     <w:p>
       <w:pPr>
         <w:pStyle w:val="Heading4"/>
@@ -786,7 +1081,7 @@
         <w:pStyle w:val="Compact"/>
         <w:numPr>
           <w:ilvl w:val="0"/>
-          <w:numId w:val="1008"/>
+          <w:numId w:val="1009"/>
         </w:numPr>
       </w:pPr>
       <w:r>
@@ -817,7 +1112,7 @@
         <w:pStyle w:val="Compact"/>
         <w:numPr>
           <w:ilvl w:val="0"/>
-          <w:numId w:val="1008"/>
+          <w:numId w:val="1009"/>
         </w:numPr>
       </w:pPr>
       <w:r>
@@ -836,7 +1131,7 @@
         <w:pStyle w:val="Compact"/>
         <w:numPr>
           <w:ilvl w:val="0"/>
-          <w:numId w:val="1008"/>
+          <w:numId w:val="1009"/>
         </w:numPr>
       </w:pPr>
       <w:r>
@@ -855,7 +1150,7 @@
         <w:pStyle w:val="Compact"/>
         <w:numPr>
           <w:ilvl w:val="0"/>
-          <w:numId w:val="1008"/>
+          <w:numId w:val="1009"/>
         </w:numPr>
       </w:pPr>
       <w:r>
@@ -895,8 +1190,8 @@
         <w:t xml:space="preserve">that you maintained control and responsibility for the work.</w:t>
       </w:r>
     </w:p>
-    <w:bookmarkEnd w:id="18"/>
-    <w:bookmarkStart w:id="19" w:name="write-out-your-core-ideas-in-prompts"/>
+    <w:bookmarkEnd w:id="23"/>
+    <w:bookmarkStart w:id="24" w:name="write-out-your-core-ideas-in-prompts"/>
     <w:p>
       <w:pPr>
         <w:pStyle w:val="Heading4"/>
@@ -944,7 +1239,7 @@
         <w:pStyle w:val="Compact"/>
         <w:numPr>
           <w:ilvl w:val="0"/>
-          <w:numId w:val="1009"/>
+          <w:numId w:val="1010"/>
         </w:numPr>
       </w:pPr>
       <w:r>
@@ -956,7 +1251,7 @@
         <w:pStyle w:val="Compact"/>
         <w:numPr>
           <w:ilvl w:val="0"/>
-          <w:numId w:val="1009"/>
+          <w:numId w:val="1010"/>
         </w:numPr>
       </w:pPr>
       <w:r>
@@ -968,7 +1263,7 @@
         <w:pStyle w:val="Compact"/>
         <w:numPr>
           <w:ilvl w:val="0"/>
-          <w:numId w:val="1009"/>
+          <w:numId w:val="1010"/>
         </w:numPr>
       </w:pPr>
       <w:r>
@@ -980,7 +1275,7 @@
         <w:pStyle w:val="Compact"/>
         <w:numPr>
           <w:ilvl w:val="0"/>
-          <w:numId w:val="1009"/>
+          <w:numId w:val="1010"/>
         </w:numPr>
       </w:pPr>
       <w:r>
@@ -992,7 +1287,7 @@
         <w:pStyle w:val="Compact"/>
         <w:numPr>
           <w:ilvl w:val="0"/>
-          <w:numId w:val="1009"/>
+          <w:numId w:val="1010"/>
         </w:numPr>
       </w:pPr>
       <w:r>
@@ -1111,8 +1406,8 @@
         <w:t xml:space="preserve">and make it unclear whose ideas are being presented.</w:t>
       </w:r>
     </w:p>
-    <w:bookmarkEnd w:id="19"/>
-    <w:bookmarkStart w:id="20" w:name="request-explicit-source-attribution"/>
+    <w:bookmarkEnd w:id="24"/>
+    <w:bookmarkStart w:id="25" w:name="request-explicit-source-attribution"/>
     <w:p>
       <w:pPr>
         <w:pStyle w:val="Heading4"/>
@@ -1202,7 +1497,7 @@
         <w:pStyle w:val="Compact"/>
         <w:numPr>
           <w:ilvl w:val="0"/>
-          <w:numId w:val="1010"/>
+          <w:numId w:val="1011"/>
         </w:numPr>
       </w:pPr>
       <w:r>
@@ -1214,7 +1509,7 @@
         <w:pStyle w:val="Compact"/>
         <w:numPr>
           <w:ilvl w:val="0"/>
-          <w:numId w:val="1010"/>
+          <w:numId w:val="1011"/>
         </w:numPr>
       </w:pPr>
       <w:r>
@@ -1226,7 +1521,7 @@
         <w:pStyle w:val="Compact"/>
         <w:numPr>
           <w:ilvl w:val="0"/>
-          <w:numId w:val="1010"/>
+          <w:numId w:val="1011"/>
         </w:numPr>
       </w:pPr>
       <w:r>
@@ -1238,7 +1533,7 @@
         <w:pStyle w:val="Compact"/>
         <w:numPr>
           <w:ilvl w:val="0"/>
-          <w:numId w:val="1010"/>
+          <w:numId w:val="1011"/>
         </w:numPr>
       </w:pPr>
       <w:r>
@@ -1250,7 +1545,7 @@
         <w:pStyle w:val="Compact"/>
         <w:numPr>
           <w:ilvl w:val="0"/>
-          <w:numId w:val="1010"/>
+          <w:numId w:val="1011"/>
         </w:numPr>
       </w:pPr>
       <w:r>
@@ -1336,8 +1631,8 @@
         <w:t xml:space="preserve">citations).</w:t>
       </w:r>
     </w:p>
-    <w:bookmarkEnd w:id="20"/>
-    <w:bookmarkStart w:id="21" w:name="example-workflow"/>
+    <w:bookmarkEnd w:id="25"/>
+    <w:bookmarkStart w:id="26" w:name="example-workflow"/>
     <w:p>
       <w:pPr>
         <w:pStyle w:val="Heading4"/>
@@ -1359,7 +1654,7 @@
         <w:pStyle w:val="Compact"/>
         <w:numPr>
           <w:ilvl w:val="0"/>
-          <w:numId w:val="1011"/>
+          <w:numId w:val="1012"/>
         </w:numPr>
       </w:pPr>
       <w:r>
@@ -1378,7 +1673,7 @@
         <w:pStyle w:val="Compact"/>
         <w:numPr>
           <w:ilvl w:val="0"/>
-          <w:numId w:val="1011"/>
+          <w:numId w:val="1012"/>
         </w:numPr>
       </w:pPr>
       <w:r>
@@ -1397,7 +1692,7 @@
         <w:pStyle w:val="Compact"/>
         <w:numPr>
           <w:ilvl w:val="0"/>
-          <w:numId w:val="1011"/>
+          <w:numId w:val="1012"/>
         </w:numPr>
       </w:pPr>
       <w:r>
@@ -1416,7 +1711,7 @@
         <w:pStyle w:val="Compact"/>
         <w:numPr>
           <w:ilvl w:val="0"/>
-          <w:numId w:val="1011"/>
+          <w:numId w:val="1012"/>
         </w:numPr>
       </w:pPr>
       <w:r>
@@ -1462,8 +1757,8 @@
         <w:t xml:space="preserve">that you directed the AI rather than simply accepting its output.</w:t>
       </w:r>
     </w:p>
-    <w:bookmarkEnd w:id="21"/>
-    <w:bookmarkStart w:id="22" w:name="additional-considerations"/>
+    <w:bookmarkEnd w:id="26"/>
+    <w:bookmarkStart w:id="27" w:name="additional-considerations"/>
     <w:p>
       <w:pPr>
         <w:pStyle w:val="Heading4"/>
@@ -1491,7 +1786,7 @@
         <w:pStyle w:val="Compact"/>
         <w:numPr>
           <w:ilvl w:val="0"/>
-          <w:numId w:val="1012"/>
+          <w:numId w:val="1013"/>
         </w:numPr>
       </w:pPr>
       <w:r>
@@ -1524,7 +1819,7 @@
         <w:pStyle w:val="Compact"/>
         <w:numPr>
           <w:ilvl w:val="0"/>
-          <w:numId w:val="1012"/>
+          <w:numId w:val="1013"/>
         </w:numPr>
       </w:pPr>
       <w:r>
@@ -1543,7 +1838,7 @@
         <w:pStyle w:val="Compact"/>
         <w:numPr>
           <w:ilvl w:val="0"/>
-          <w:numId w:val="1012"/>
+          <w:numId w:val="1013"/>
         </w:numPr>
       </w:pPr>
       <w:r>
@@ -1562,7 +1857,7 @@
         <w:pStyle w:val="Compact"/>
         <w:numPr>
           <w:ilvl w:val="0"/>
-          <w:numId w:val="1012"/>
+          <w:numId w:val="1013"/>
         </w:numPr>
       </w:pPr>
       <w:r>
@@ -1581,7 +1876,7 @@
         <w:pStyle w:val="Compact"/>
         <w:numPr>
           <w:ilvl w:val="0"/>
-          <w:numId w:val="1012"/>
+          <w:numId w:val="1013"/>
         </w:numPr>
       </w:pPr>
       <w:r>
@@ -1621,9 +1916,9 @@
         <w:t xml:space="preserve">and credibility of your academic work.</w:t>
       </w:r>
     </w:p>
-    <w:bookmarkEnd w:id="22"/>
-    <w:bookmarkEnd w:id="23"/>
-    <w:bookmarkStart w:id="25" w:name="references"/>
+    <w:bookmarkEnd w:id="27"/>
+    <w:bookmarkEnd w:id="28"/>
+    <w:bookmarkStart w:id="30" w:name="references"/>
     <w:p>
       <w:pPr>
         <w:pStyle w:val="Heading1"/>
@@ -1632,9 +1927,9 @@
         <w:t xml:space="preserve">References</w:t>
       </w:r>
     </w:p>
-    <w:bookmarkStart w:id="24" w:name="refs"/>
-    <w:bookmarkEnd w:id="24"/>
-    <w:bookmarkEnd w:id="25"/>
+    <w:bookmarkStart w:id="29" w:name="refs"/>
+    <w:bookmarkEnd w:id="29"/>
+    <w:bookmarkEnd w:id="30"/>
     <w:sectPr>
       <w:footnotePr>
         <w:numRestart w:val="eachSect"/>
@@ -2043,6 +2338,9 @@
     <w:abstractNumId w:val="991"/>
   </w:num>
   <w:num w:numId="1011">
+    <w:abstractNumId w:val="991"/>
+  </w:num>
+  <w:num w:numId="1012">
     <w:abstractNumId w:val="99411"/>
     <w:lvlOverride w:ilvl="0">
       <w:startOverride w:val="1"/>
@@ -2072,7 +2370,7 @@
       <w:startOverride w:val="1"/>
     </w:lvlOverride>
   </w:num>
-  <w:num w:numId="1012">
+  <w:num w:numId="1013">
     <w:abstractNumId w:val="991"/>
   </w:num>
 </w:numbering>

</xml_diff>